<commit_message>
load new page stabile...
</commit_message>
<xml_diff>
--- a/DOCS_DA_CONVERTIRE/stabile-legno-vandini_en.docx
+++ b/DOCS_DA_CONVERTIRE/stabile-legno-vandini_en.docx
@@ -78,34 +78,40 @@
         <w:rPr>
           <w:noProof/>
         </w:rPr>
-        <w:t>[</w:t>
-      </w:r>
-      <w:r>
-        <w:rPr>
-          <w:noProof/>
-        </w:rPr>
-        <w:t>SPLIT_BLOCK:</w:t>
-      </w:r>
-      <w:r>
-        <w:rPr>
-          <w:noProof/>
-        </w:rPr>
-        <w:t>stable-wooden-washbasins-one</w:t>
-      </w:r>
-      <w:r>
-        <w:rPr>
-          <w:noProof/>
-        </w:rPr>
-        <w:t>]</w:t>
-      </w:r>
-    </w:p>
-    <w:p>
-      <w:r>
-        <w:t>Made with a wooden load-bearing structure (X-technology</w:t>
+        <w:t>[SPLIT_BLOCK:stabile-legno-vandini-uno.jpg]</w:t>
+      </w:r>
+    </w:p>
+    <w:p>
+      <w:r>
+        <w:t xml:space="preserve">Made with a </w:t>
       </w:r>
       <w:proofErr w:type="spellStart"/>
       <w:r>
-        <w:t>Lam</w:t>
+        <w:t>wooden</w:t>
+      </w:r>
+      <w:proofErr w:type="spellEnd"/>
+      <w:r>
+        <w:t xml:space="preserve"> load-</w:t>
+      </w:r>
+      <w:proofErr w:type="spellStart"/>
+      <w:r>
+        <w:t>bearing</w:t>
+      </w:r>
+      <w:proofErr w:type="spellEnd"/>
+      <w:r>
+        <w:t xml:space="preserve"> </w:t>
+      </w:r>
+      <w:proofErr w:type="spellStart"/>
+      <w:r>
+        <w:t>structure</w:t>
+      </w:r>
+      <w:proofErr w:type="spellEnd"/>
+      <w:r>
+        <w:t xml:space="preserve"> (X-</w:t>
+      </w:r>
+      <w:proofErr w:type="spellStart"/>
+      <w:r>
+        <w:t>technologyLam</w:t>
       </w:r>
       <w:proofErr w:type="spellEnd"/>
       <w:r>
@@ -174,48 +180,43 @@
         <w:rPr>
           <w:noProof/>
         </w:rPr>
-        <w:t>[</w:t>
+        <w:t>[SPLIT_BLOCK:stabile-legno-vandini-</w:t>
       </w:r>
       <w:r>
         <w:rPr>
           <w:noProof/>
         </w:rPr>
-        <w:t>SPLIT_BLOCK:</w:t>
+        <w:t>due</w:t>
       </w:r>
       <w:r>
         <w:rPr>
           <w:noProof/>
         </w:rPr>
-        <w:t xml:space="preserve"> </w:t>
-      </w:r>
-      <w:r>
-        <w:rPr>
-          <w:noProof/>
-        </w:rPr>
-        <w:t>image_name_two</w:t>
-      </w:r>
-      <w:r>
-        <w:rPr>
-          <w:noProof/>
-        </w:rPr>
-        <w:t>.jpg</w:t>
-      </w:r>
-      <w:r>
-        <w:rPr>
-          <w:noProof/>
+        <w:t>.jpg]</w:t>
+      </w:r>
+    </w:p>
+    <w:p>
+      <w:proofErr w:type="spellStart"/>
+      <w:r>
+        <w:lastRenderedPageBreak/>
+        <w:t>Despite</w:t>
+      </w:r>
+      <w:proofErr w:type="spellEnd"/>
+      <w:r>
+        <w:t xml:space="preserve"> the </w:t>
+      </w:r>
+      <w:proofErr w:type="spellStart"/>
+      <w:r>
+        <w:t>solid</w:t>
+      </w:r>
+      <w:proofErr w:type="spellEnd"/>
+      <w:r>
+        <w:t xml:space="preserve"> and perfectly integrated appearance, the choice of wood allowed for rapid construction and minimized environmental impact. It is a building that "breathes", capable of maintaining an ideal temperature in every season without wasting energy, demonstrating that</w:t>
+      </w:r>
+      <w:r>
+        <w:rPr>
           <w:u w:val="single"/>
         </w:rPr>
-        <w:t>]</w:t>
-      </w:r>
-    </w:p>
-    <w:p>
-      <w:r>
-        <w:t>Despite the solid and perfectly integrated appearance, the choice of wood allowed for rapid construction and minimized environmental impact. It is a building that "breathes", capable of maintaining an ideal temperature in every season without wasting energy, demonstrating that</w:t>
-      </w:r>
-      <w:r>
-        <w:rPr>
-          <w:u w:val="single"/>
-        </w:rPr>
         <w:t>Also</w:t>
       </w:r>
       <w:r>
@@ -224,7 +225,11 @@
     </w:p>
     <w:p>
       <w:r>
-        <w:t>The technology</w:t>
+        <w:t xml:space="preserve">The </w:t>
+      </w:r>
+      <w:proofErr w:type="spellStart"/>
+      <w:r>
+        <w:t>technology</w:t>
       </w:r>
       <w:r>
         <w:rPr>
@@ -233,7 +238,7 @@
         </w:rPr>
         <w:t>X-</w:t>
       </w:r>
-      <w:proofErr w:type="spellStart"/>
+      <w:proofErr w:type="gramStart"/>
       <w:r>
         <w:rPr>
           <w:b/>
@@ -243,7 +248,28 @@
       </w:r>
       <w:proofErr w:type="spellEnd"/>
       <w:r>
-        <w:t>(also known as</w:t>
+        <w:t>(</w:t>
+      </w:r>
+      <w:proofErr w:type="spellStart"/>
+      <w:proofErr w:type="gramEnd"/>
+      <w:r>
+        <w:t>also</w:t>
+      </w:r>
+      <w:proofErr w:type="spellEnd"/>
+      <w:r>
+        <w:t xml:space="preserve"> </w:t>
+      </w:r>
+      <w:proofErr w:type="spellStart"/>
+      <w:r>
+        <w:t>known</w:t>
+      </w:r>
+      <w:proofErr w:type="spellEnd"/>
+      <w:r>
+        <w:t xml:space="preserve"> </w:t>
+      </w:r>
+      <w:proofErr w:type="spellStart"/>
+      <w:r>
+        <w:t>as</w:t>
       </w:r>
       <w:r>
         <w:rPr>
@@ -252,34 +278,32 @@
         </w:rPr>
         <w:t>CLT</w:t>
       </w:r>
-      <w:r>
-        <w:t>, from English</w:t>
+      <w:proofErr w:type="spellEnd"/>
+      <w:r>
+        <w:t xml:space="preserve">, from </w:t>
+      </w:r>
+      <w:proofErr w:type="spellStart"/>
+      <w:r>
+        <w:t>English</w:t>
       </w:r>
       <w:r>
         <w:rPr>
           <w:i/>
           <w:iCs/>
         </w:rPr>
-        <w:t>Crosses</w:t>
+        <w:t>CrossesLaminatedTimber</w:t>
+      </w:r>
+      <w:proofErr w:type="spellEnd"/>
+      <w:r>
+        <w:t xml:space="preserve">) </w:t>
       </w:r>
       <w:proofErr w:type="spellStart"/>
       <w:r>
-        <w:rPr>
-          <w:i/>
-          <w:iCs/>
-        </w:rPr>
-        <w:t>Laminated</w:t>
+        <w:t>represents</w:t>
       </w:r>
       <w:proofErr w:type="spellEnd"/>
       <w:r>
-        <w:rPr>
-          <w:i/>
-          <w:iCs/>
-        </w:rPr>
-        <w:t>Timber</w:t>
-      </w:r>
-      <w:r>
-        <w:t>) represents one of the most significant innovations in the field of sustainable construction. It is a construction system based on cross-laminated solid wood laminated panels.</w:t>
+        <w:t xml:space="preserve"> one of the most significant innovations in the field of sustainable construction. It is a construction system based on cross-laminated solid wood laminated panels.</w:t>
       </w:r>
     </w:p>
     <w:p>
@@ -287,28 +311,52 @@
         <w:pStyle w:val="Titolo2"/>
       </w:pPr>
       <w:r>
-        <w:t>How an X-panel is made</w:t>
+        <w:t xml:space="preserve">How an X-panel </w:t>
       </w:r>
       <w:proofErr w:type="spellStart"/>
       <w:r>
-        <w:t>Lam</w:t>
+        <w:t>is</w:t>
       </w:r>
       <w:proofErr w:type="spellEnd"/>
       <w:r>
+        <w:t xml:space="preserve"> </w:t>
+      </w:r>
+      <w:proofErr w:type="spellStart"/>
+      <w:r>
+        <w:t>madeLam</w:t>
+      </w:r>
+      <w:proofErr w:type="spellEnd"/>
+      <w:r>
         <w:t>?</w:t>
       </w:r>
     </w:p>
     <w:p>
       <w:r>
-        <w:t>An X-panel</w:t>
+        <w:t>An X-</w:t>
       </w:r>
       <w:proofErr w:type="spellStart"/>
       <w:r>
-        <w:t>Lam</w:t>
+        <w:t>panelLamit</w:t>
       </w:r>
       <w:proofErr w:type="spellEnd"/>
       <w:r>
-        <w:t>it is composed of several layers (usually 3, 5 or 7) of conifer wood boards (often fir), dried and overlapped so that the grain of each layer is</w:t>
+        <w:t xml:space="preserve"> </w:t>
+      </w:r>
+      <w:proofErr w:type="spellStart"/>
+      <w:r>
+        <w:t>is</w:t>
+      </w:r>
+      <w:proofErr w:type="spellEnd"/>
+      <w:r>
+        <w:t xml:space="preserve"> </w:t>
+      </w:r>
+      <w:proofErr w:type="spellStart"/>
+      <w:r>
+        <w:t>composed</w:t>
+      </w:r>
+      <w:proofErr w:type="spellEnd"/>
+      <w:r>
+        <w:t xml:space="preserve"> of several layers (usually 3, 5 or 7) of conifer wood boards (often fir), dried and overlapped so that the grain of each layer is</w:t>
       </w:r>
       <w:r>
         <w:rPr>
@@ -431,19 +479,19 @@
         <w:rPr>
           <w:noProof/>
         </w:rPr>
-        <w:t>[SPLIT_BLOCK:</w:t>
+        <w:t>[SPLIT_BLOCK:tecnologia_</w:t>
       </w:r>
       <w:r>
         <w:rPr>
           <w:noProof/>
         </w:rPr>
-        <w:t xml:space="preserve"> </w:t>
+        <w:t>x-lam</w:t>
       </w:r>
       <w:r>
         <w:rPr>
           <w:noProof/>
         </w:rPr>
-        <w:t>X-Lam technology.jpg</w:t>
+        <w:t>.jpg</w:t>
       </w:r>
       <w:r>
         <w:rPr>
@@ -453,63 +501,10 @@
         <w:t>]</w:t>
       </w:r>
     </w:p>
-    <w:p/>
-    <w:p>
-      <w:r>
-        <w:t>{</w:t>
-      </w:r>
-      <w:r>
-        <w:rPr>
-          <w:i/>
-          <w:iCs/>
-        </w:rPr>
-        <w:t>replace this phrase delimited by curly brackets</w:t>
-      </w:r>
-      <w:r>
-        <w:rPr>
-          <w:i/>
-          <w:iCs/>
-        </w:rPr>
-        <w:t>(including curly braces)</w:t>
-      </w:r>
-      <w:r>
-        <w:rPr>
-          <w:i/>
-          <w:iCs/>
-        </w:rPr>
-        <w:t>with the text of the document that needs to be placed</w:t>
-      </w:r>
-      <w:r>
-        <w:rPr>
-          <w:i/>
-          <w:iCs/>
-        </w:rPr>
-        <w:t>between the second</w:t>
-      </w:r>
-      <w:r>
-        <w:rPr>
-          <w:i/>
-          <w:iCs/>
-        </w:rPr>
-        <w:t xml:space="preserve"> </w:t>
-      </w:r>
-      <w:r>
-        <w:rPr>
-          <w:i/>
-          <w:iCs/>
-        </w:rPr>
-        <w:t>and the third</w:t>
-      </w:r>
-      <w:r>
-        <w:rPr>
-          <w:i/>
-          <w:iCs/>
-        </w:rPr>
-        <w:t>image</w:t>
-      </w:r>
-      <w:r>
-        <w:t>}</w:t>
-      </w:r>
+    <w:p>
+      <w:pPr>
+        <w:jc w:val="center"/>
+      </w:pPr>
     </w:p>
     <w:p>
       <w:pPr>
@@ -518,33 +513,61 @@
           <w:bCs/>
         </w:rPr>
       </w:pPr>
-    </w:p>
-    <w:p>
-      <w:pPr>
+      <w:r>
         <w:rPr>
           <w:b/>
           <w:bCs/>
         </w:rPr>
-      </w:pPr>
+        <w:t xml:space="preserve">The </w:t>
+      </w:r>
+      <w:proofErr w:type="spellStart"/>
       <w:r>
         <w:rPr>
           <w:b/>
           <w:bCs/>
         </w:rPr>
-        <w:t>The main advantages</w:t>
-      </w:r>
+        <w:t>main</w:t>
+      </w:r>
+      <w:proofErr w:type="spellEnd"/>
+      <w:r>
+        <w:rPr>
+          <w:b/>
+          <w:bCs/>
+        </w:rPr>
+        <w:t xml:space="preserve"> </w:t>
+      </w:r>
+      <w:proofErr w:type="spellStart"/>
+      <w:r>
+        <w:rPr>
+          <w:b/>
+          <w:bCs/>
+        </w:rPr>
+        <w:t>advantages</w:t>
+      </w:r>
+      <w:proofErr w:type="spellEnd"/>
     </w:p>
     <w:p>
       <w:r>
         <w:t>The use of the</w:t>
       </w:r>
+      <w:r>
+        <w:t xml:space="preserve"> X-</w:t>
+      </w:r>
       <w:proofErr w:type="spellStart"/>
       <w:r>
         <w:t>Lam</w:t>
       </w:r>
       <w:proofErr w:type="spellEnd"/>
       <w:r>
-        <w:t>is revolutionizing the way of building for several reasons:</w:t>
+        <w:t xml:space="preserve"> </w:t>
+      </w:r>
+      <w:proofErr w:type="spellStart"/>
+      <w:r>
+        <w:t>revolutionizing</w:t>
+      </w:r>
+      <w:proofErr w:type="spellEnd"/>
+      <w:r>
+        <w:t xml:space="preserve"> the way of building for several reasons:</w:t>
       </w:r>
     </w:p>
     <w:p>
@@ -586,15 +609,31 @@
         <w:t>Seismic Safety:</w:t>
       </w:r>
       <w:r>
-        <w:t>Thanks to the natural elasticity of the wood and the ability of the mechanical joints to dissipate energy, the structures in</w:t>
+        <w:t xml:space="preserve">Thanks to the natural elasticity of the wood and the ability of the mechanical joints to dissipate energy, the </w:t>
       </w:r>
       <w:proofErr w:type="spellStart"/>
       <w:r>
-        <w:t>Lam</w:t>
+        <w:t>structures</w:t>
       </w:r>
       <w:proofErr w:type="spellEnd"/>
       <w:r>
-        <w:t>they are among the safest in the event of an earthquake.</w:t>
+        <w:t xml:space="preserve"> </w:t>
+      </w:r>
+      <w:proofErr w:type="spellStart"/>
+      <w:r>
+        <w:t>inLamthey</w:t>
+      </w:r>
+      <w:proofErr w:type="spellEnd"/>
+      <w:r>
+        <w:t xml:space="preserve"> are </w:t>
+      </w:r>
+      <w:proofErr w:type="spellStart"/>
+      <w:r>
+        <w:t>among</w:t>
+      </w:r>
+      <w:proofErr w:type="spellEnd"/>
+      <w:r>
+        <w:t xml:space="preserve"> the safest in the event of an earthquake.</w:t>
       </w:r>
     </w:p>
     <w:p>
@@ -609,6 +648,7 @@
           <w:b/>
           <w:bCs/>
         </w:rPr>
+        <w:lastRenderedPageBreak/>
         <w:t>Fire Resistance:</w:t>
       </w:r>
       <w:r>
@@ -657,15 +697,31 @@
     </w:p>
     <w:p>
       <w:r>
-        <w:t>While in the past wood was limited to cabins or small buildings, the</w:t>
+        <w:t xml:space="preserve">While in the past wood was limited to cabins or small buildings, </w:t>
       </w:r>
       <w:proofErr w:type="spellStart"/>
       <w:r>
-        <w:t>Lam</w:t>
+        <w:t>theLamtoday</w:t>
       </w:r>
       <w:proofErr w:type="spellEnd"/>
       <w:r>
-        <w:t>today allows the construction of:</w:t>
+        <w:t xml:space="preserve"> </w:t>
+      </w:r>
+      <w:proofErr w:type="spellStart"/>
+      <w:r>
+        <w:t>allows</w:t>
+      </w:r>
+      <w:proofErr w:type="spellEnd"/>
+      <w:r>
+        <w:t xml:space="preserve"> the </w:t>
+      </w:r>
+      <w:proofErr w:type="spellStart"/>
+      <w:r>
+        <w:t>construction</w:t>
+      </w:r>
+      <w:proofErr w:type="spellEnd"/>
+      <w:r>
+        <w:t xml:space="preserve"> of:</w:t>
       </w:r>
     </w:p>
     <w:p>
@@ -724,15 +780,39 @@
     </w:p>
     <w:p>
       <w:r>
-        <w:t>In summary, the</w:t>
+        <w:t xml:space="preserve">In </w:t>
       </w:r>
       <w:proofErr w:type="spellStart"/>
       <w:r>
-        <w:t>Lam</w:t>
+        <w:t>summary</w:t>
       </w:r>
       <w:proofErr w:type="spellEnd"/>
       <w:r>
-        <w:t>it is considered the "concrete of the future", combining the strength of massive structures with the flexibility and warmth of wood.</w:t>
+        <w:t xml:space="preserve">, </w:t>
+      </w:r>
+      <w:proofErr w:type="spellStart"/>
+      <w:r>
+        <w:t>theLamit</w:t>
+      </w:r>
+      <w:proofErr w:type="spellEnd"/>
+      <w:r>
+        <w:t xml:space="preserve"> </w:t>
+      </w:r>
+      <w:proofErr w:type="spellStart"/>
+      <w:r>
+        <w:t>is</w:t>
+      </w:r>
+      <w:proofErr w:type="spellEnd"/>
+      <w:r>
+        <w:t xml:space="preserve"> </w:t>
+      </w:r>
+      <w:proofErr w:type="spellStart"/>
+      <w:r>
+        <w:t>considered</w:t>
+      </w:r>
+      <w:proofErr w:type="spellEnd"/>
+      <w:r>
+        <w:t xml:space="preserve"> the "concrete of the future", combining the strength of massive structures with the flexibility and warmth of wood.</w:t>
       </w:r>
     </w:p>
     <w:p>
@@ -973,6 +1053,7 @@
     </w:p>
     <w:p>
       <w:r>
+        <w:lastRenderedPageBreak/>
         <w:t>His work represents that trend of Italian architecture capable of combining the aesthetics of concrete and brick with a profound ethic of building.</w:t>
       </w:r>
     </w:p>

</xml_diff>